<commit_message>
Final v9 closeout polish: Hero hierarchy, risk copy
Unify Hero vs product slogan; add Heytea differentiation; age 22-35
tiers; swap cases to beverage peers; 心意短笺 wording; soften price/KPI
promises; sharpen closing scene-expansion line. Images unchanged.

Co-authored-by: Romola1110 <Romola1110@users.noreply.github.com>
</commit_message>
<xml_diff>
--- a/汇报提纲_心中念你_10页.docx
+++ b/汇报提纲_心中念你_10页.docx
@@ -10,9 +10,9 @@
         <w:rPr>
           <w:rFonts w:ascii="黑体" w:hAnsi="黑体" w:eastAsia="黑体"/>
           <w:b/>
-          <w:sz w:val="32"/>
+          <w:sz w:val="30"/>
         </w:rPr>
-        <w:t>喜茶 ×《给阿嬷的情书》｜10页汇报提纲</w:t>
+        <w:t>喜茶 ×《给阿嬷的情书》｜10页汇报提纲（v9收口）</w:t>
       </w:r>
     </w:p>
     <w:p>
@@ -31,13 +31,13 @@
     </w:p>
     <w:p>
       <w:pPr>
-        <w:spacing w:before="200" w:after="80"/>
+        <w:spacing w:before="160" w:after="60"/>
       </w:pPr>
       <w:r>
         <w:rPr>
           <w:rFonts w:ascii="黑体" w:hAnsi="黑体" w:eastAsia="黑体"/>
           <w:b/>
-          <w:sz w:val="28"/>
+          <w:sz w:val="26"/>
         </w:rPr>
         <w:t>01 项目判断</w:t>
       </w:r>
@@ -52,7 +52,7 @@
           <w:b w:val="0"/>
           <w:sz w:val="22"/>
         </w:rPr>
-        <w:t>从流量联名到资产联名；喜茶需补「有温度」的东方关系表达。</w:t>
+        <w:t>从流量联名到资产联名；喜茶需补「有温度」的关系表达入口。</w:t>
       </w:r>
     </w:p>
     <w:p>
@@ -65,7 +65,7 @@
           <w:b w:val="0"/>
           <w:sz w:val="22"/>
         </w:rPr>
-        <w:t>一句话：喜茶下一阶段不只制造喜欢，而要成为年轻人与重要关系的情绪连接入口。</w:t>
+        <w:t>为何是喜茶：高频年轻触点 + 可即时发生的关系动作（相对传统礼赠/纯文化商品）。</w:t>
       </w:r>
     </w:p>
     <w:p>
@@ -78,20 +78,20 @@
           <w:b w:val="0"/>
           <w:sz w:val="22"/>
         </w:rPr>
-        <w:t>《心中念你》不是回忆过去，而是创造今天表达关系的新消费动作。</w:t>
+        <w:t>商业灵魂：从喝茶到送茶，从个人消费到关系消费。</w:t>
       </w:r>
     </w:p>
     <w:p>
       <w:pPr>
-        <w:spacing w:before="200" w:after="80"/>
+        <w:spacing w:before="160" w:after="60"/>
       </w:pPr>
       <w:r>
         <w:rPr>
           <w:rFonts w:ascii="黑体" w:hAnsi="黑体" w:eastAsia="黑体"/>
           <w:b/>
-          <w:sz w:val="28"/>
+          <w:sz w:val="26"/>
         </w:rPr>
-        <w:t>02 洞察：谁买、送给谁</w:t>
+        <w:t>02 洞察</w:t>
       </w:r>
     </w:p>
     <w:p>
@@ -104,7 +104,7 @@
           <w:b w:val="0"/>
           <w:sz w:val="22"/>
         </w:rPr>
-        <w:t>核心表达者：25–35城市青年（礼赠决策人群，非宣称官方核心用户）。</w:t>
+        <w:t>核心表达者：22–35（22–28离家求学/初职场；28–35家庭礼赠）。</w:t>
       </w:r>
     </w:p>
     <w:p>
@@ -117,7 +117,7 @@
           <w:b w:val="0"/>
           <w:sz w:val="22"/>
         </w:rPr>
-        <w:t>接受者：父母/长辈/重要关系人。</w:t>
+        <w:t>接受者：父母/长辈等重要关系人。</w:t>
       </w:r>
     </w:p>
     <w:p>
@@ -130,18 +130,18 @@
           <w:b w:val="0"/>
           <w:sz w:val="22"/>
         </w:rPr>
-        <w:t>痛点：有爱，但不知道如何开口 → 需要低压力表达入口。</w:t>
+        <w:t>痛点：有爱，但不知道如何开口。</w:t>
       </w:r>
     </w:p>
     <w:p>
       <w:pPr>
-        <w:spacing w:before="200" w:after="80"/>
+        <w:spacing w:before="160" w:after="60"/>
       </w:pPr>
       <w:r>
         <w:rPr>
           <w:rFonts w:ascii="黑体" w:hAnsi="黑体" w:eastAsia="黑体"/>
           <w:b/>
-          <w:sz w:val="28"/>
+          <w:sz w:val="26"/>
         </w:rPr>
         <w:t>03 Hero与三场景</w:t>
       </w:r>
@@ -156,7 +156,7 @@
           <w:b w:val="0"/>
           <w:sz w:val="22"/>
         </w:rPr>
-        <w:t>Campaign：心中念你｜Hero：把一份想念，寄到TA手里。</w:t>
+        <w:t>Campaign《心中念你》｜Hero：把一份想念，寄到TA手里。</w:t>
       </w:r>
     </w:p>
     <w:p>
@@ -169,7 +169,7 @@
           <w:b w:val="0"/>
           <w:sz w:val="22"/>
         </w:rPr>
-        <w:t>即时：给想念的人，一杯茶｜异地：给想念的人，一盒茶｜留下：写下一句想念。</w:t>
+        <w:t>即时：给想念的人，一杯茶｜异地：给想念的人，一盒茶｜留存：写下一句想念。</w:t>
       </w:r>
     </w:p>
     <w:p>
@@ -182,18 +182,18 @@
           <w:b w:val="0"/>
           <w:sz w:val="22"/>
         </w:rPr>
-        <w:t>四种入口：APP / 小程序 / 外卖送给TA / 电商茶礼。</w:t>
+        <w:t>入口：APP / 小程序 / 外卖送给TA / 电商茶礼。</w:t>
       </w:r>
     </w:p>
     <w:p>
       <w:pPr>
-        <w:spacing w:before="200" w:after="80"/>
+        <w:spacing w:before="160" w:after="60"/>
       </w:pPr>
       <w:r>
         <w:rPr>
           <w:rFonts w:ascii="黑体" w:hAnsi="黑体" w:eastAsia="黑体"/>
           <w:b/>
-          <w:sz w:val="28"/>
+          <w:sz w:val="26"/>
         </w:rPr>
         <w:t>04 产品三层</w:t>
       </w:r>
@@ -208,7 +208,7 @@
           <w:b w:val="0"/>
           <w:sz w:val="22"/>
         </w:rPr>
-        <w:t>即时现制：念你·焙香牛乳茶（走量）+ 南枝橄榄茶（文化）+ 归信桂花茶（节日）。</w:t>
+        <w:t>现制：念你牛乳茶 / 南枝橄榄茶 / 归信桂花茶。</w:t>
       </w:r>
     </w:p>
     <w:p>
@@ -221,7 +221,7 @@
           <w:b w:val="0"/>
           <w:sz w:val="22"/>
         </w:rPr>
-        <w:t>远距茶礼：探索可寄达茶礼（战略工具，非为扩SKU）。</w:t>
+        <w:t>茶礼：探索可寄达形态（战略工具，非为扩SKU）。</w:t>
       </w:r>
     </w:p>
     <w:p>
@@ -234,20 +234,20 @@
           <w:b w:val="0"/>
           <w:sz w:val="22"/>
         </w:rPr>
-        <w:t>情绪资产：念你邮局 × 许多句念你。</w:t>
+        <w:t>邮局 × 许多句念你。</w:t>
       </w:r>
     </w:p>
     <w:p>
       <w:pPr>
-        <w:spacing w:before="200" w:after="80"/>
+        <w:spacing w:before="160" w:after="60"/>
       </w:pPr>
       <w:r>
         <w:rPr>
           <w:rFonts w:ascii="黑体" w:hAnsi="黑体" w:eastAsia="黑体"/>
           <w:b/>
-          <w:sz w:val="28"/>
+          <w:sz w:val="26"/>
         </w:rPr>
-        <w:t>05 为什么要茶礼</w:t>
+        <w:t>05 茶礼为何必要</w:t>
       </w:r>
     </w:p>
     <w:p>
@@ -260,7 +260,7 @@
           <w:b w:val="0"/>
           <w:sz w:val="22"/>
         </w:rPr>
-        <w:t>现制无法跨地域表达；茶礼是「送茶」成立的必要基础。</w:t>
+        <w:t>解决现制无法跨地域表达；是送茶成立的必要基础。</w:t>
       </w:r>
     </w:p>
     <w:p>
@@ -273,7 +273,20 @@
           <w:b w:val="0"/>
           <w:sz w:val="22"/>
         </w:rPr>
-        <w:t>基于现有零售能力探索；立项再确认生产/渠道/保质期/成本。</w:t>
+        <w:t>示意价仅验证场景，非正式定价。</w:t>
+      </w:r>
+    </w:p>
+    <w:p>
+      <w:pPr>
+        <w:spacing w:before="160" w:after="60"/>
+      </w:pPr>
+      <w:r>
+        <w:rPr>
+          <w:rFonts w:ascii="黑体" w:hAnsi="黑体" w:eastAsia="黑体"/>
+          <w:b/>
+          <w:sz w:val="26"/>
+        </w:rPr>
+        <w:t>06 KPI（先卖不卖）</w:t>
       </w:r>
     </w:p>
     <w:p>
@@ -286,20 +299,7 @@
           <w:b w:val="0"/>
           <w:sz w:val="22"/>
         </w:rPr>
-        <w:t>示意价：标准约59 / 家庭约89（非真实售价）。</w:t>
-      </w:r>
-    </w:p>
-    <w:p>
-      <w:pPr>
-        <w:spacing w:before="200" w:after="80"/>
-      </w:pPr>
-      <w:r>
-        <w:rPr>
-          <w:rFonts w:ascii="黑体" w:hAnsi="黑体" w:eastAsia="黑体"/>
-          <w:b/>
-          <w:sz w:val="28"/>
-        </w:rPr>
-        <w:t>06 商业模型与KPI（先讲卖不卖）</w:t>
+        <w:t>销售：联名销售额、杯量、茶礼、客单。</w:t>
       </w:r>
     </w:p>
     <w:p>
@@ -312,7 +312,7 @@
           <w:b w:val="0"/>
           <w:sz w:val="22"/>
         </w:rPr>
-        <w:t>销售：联名销售额、杯量、茶礼销量、客单。</w:t>
+        <w:t>转化：购买率、礼赠GMV占比、连带购买率、送礼订单占比。</w:t>
       </w:r>
     </w:p>
     <w:p>
@@ -325,7 +325,20 @@
           <w:b w:val="0"/>
           <w:sz w:val="22"/>
         </w:rPr>
-        <w:t>转化：购买率、礼赠GMV占比、连带购买率、送礼订单占联名订单比。</w:t>
+        <w:t>内容资产量级按试点调整，不拍脑袋承诺。</w:t>
+      </w:r>
+    </w:p>
+    <w:p>
+      <w:pPr>
+        <w:spacing w:before="160" w:after="60"/>
+      </w:pPr>
+      <w:r>
+        <w:rPr>
+          <w:rFonts w:ascii="黑体" w:hAnsi="黑体" w:eastAsia="黑体"/>
+          <w:b/>
+          <w:sz w:val="26"/>
+        </w:rPr>
+        <w:t>07 执行</w:t>
       </w:r>
     </w:p>
     <w:p>
@@ -338,20 +351,7 @@
           <w:b w:val="0"/>
           <w:sz w:val="22"/>
         </w:rPr>
-        <w:t>目标模型示意：50店×80杯×28天≈11.2万杯（假设非预测）。</w:t>
-      </w:r>
-    </w:p>
-    <w:p>
-      <w:pPr>
-        <w:spacing w:before="200" w:after="80"/>
-      </w:pPr>
-      <w:r>
-        <w:rPr>
-          <w:rFonts w:ascii="黑体" w:hAnsi="黑体" w:eastAsia="黑体"/>
-          <w:b/>
-          <w:sz w:val="28"/>
-        </w:rPr>
-        <w:t>07 执行与小规模验证</w:t>
+        <w:t>华南+沪/京小规模验证；三阶段门禁。</w:t>
       </w:r>
     </w:p>
     <w:p>
@@ -364,33 +364,20 @@
           <w:b w:val="0"/>
           <w:sz w:val="22"/>
         </w:rPr>
-        <w:t>试点：华南 + 沪/京内容城；Phase1验证→Phase2扩散→Phase3资产沉淀。</w:t>
+        <w:t>邮局轻互动 + 会员二次触达。</w:t>
       </w:r>
     </w:p>
     <w:p>
       <w:pPr>
-        <w:pStyle w:val="ListBullet"/>
-      </w:pPr>
-      <w:r>
-        <w:rPr>
-          <w:rFonts w:ascii="宋体" w:hAnsi="宋体" w:eastAsia="宋体"/>
-          <w:b w:val="0"/>
-          <w:sz w:val="22"/>
-        </w:rPr>
-        <w:t>门店：邮局轻互动；许多句念你精选展示；会员二次触达。</w:t>
-      </w:r>
-    </w:p>
-    <w:p>
-      <w:pPr>
-        <w:spacing w:before="200" w:after="80"/>
+        <w:spacing w:before="160" w:after="60"/>
       </w:pPr>
       <w:r>
         <w:rPr>
           <w:rFonts w:ascii="黑体" w:hAnsi="黑体" w:eastAsia="黑体"/>
           <w:b/>
-          <w:sz w:val="28"/>
+          <w:sz w:val="26"/>
         </w:rPr>
-        <w:t>08 视觉收口</w:t>
+        <w:t>08 视觉</w:t>
       </w:r>
     </w:p>
     <w:p>
@@ -416,20 +403,20 @@
           <w:b w:val="0"/>
           <w:sz w:val="22"/>
         </w:rPr>
-        <w:t>延展：一杯茶 / 一盒茶 / 写下一句想念；Campaign气质图仅backup。</w:t>
+        <w:t>延展：一杯茶 / 一盒茶 / 写下一句想念。</w:t>
       </w:r>
     </w:p>
     <w:p>
       <w:pPr>
-        <w:spacing w:before="200" w:after="80"/>
+        <w:spacing w:before="160" w:after="60"/>
       </w:pPr>
       <w:r>
         <w:rPr>
           <w:rFonts w:ascii="黑体" w:hAnsi="黑体" w:eastAsia="黑体"/>
           <w:b/>
-          <w:sz w:val="28"/>
+          <w:sz w:val="26"/>
         </w:rPr>
-        <w:t>09 风险与边界</w:t>
+        <w:t>09 风险</w:t>
       </w:r>
     </w:p>
     <w:p>
@@ -442,7 +429,20 @@
           <w:b w:val="0"/>
           <w:sz w:val="22"/>
         </w:rPr>
-        <w:t>茶礼供应链假设降级为探索；远距不靠现制兑换券。</w:t>
+        <w:t>茶礼探索语气；远距不靠现制券；数据脚注化；隐私三选一。</w:t>
+      </w:r>
+    </w:p>
+    <w:p>
+      <w:pPr>
+        <w:spacing w:before="160" w:after="60"/>
+      </w:pPr>
+      <w:r>
+        <w:rPr>
+          <w:rFonts w:ascii="黑体" w:hAnsi="黑体" w:eastAsia="黑体"/>
+          <w:b/>
+          <w:sz w:val="26"/>
+        </w:rPr>
+        <w:t>10 收口</w:t>
       </w:r>
     </w:p>
     <w:p>
@@ -455,59 +455,20 @@
           <w:b w:val="0"/>
           <w:sz w:val="22"/>
         </w:rPr>
-        <w:t>数据引用降风险；未授权不宣称官联；隐私三选一。</w:t>
+        <w:t>从满足「我喜欢喝什么」，到回应「我想把什么送给重要的人」。</w:t>
       </w:r>
     </w:p>
     <w:p>
       <w:pPr>
-        <w:spacing w:before="200" w:after="80"/>
+        <w:spacing w:before="160" w:after="60"/>
       </w:pPr>
       <w:r>
         <w:rPr>
           <w:rFonts w:ascii="黑体" w:hAnsi="黑体" w:eastAsia="黑体"/>
           <w:b/>
-          <w:sz w:val="28"/>
+          <w:sz w:val="26"/>
         </w:rPr>
-        <w:t>10 长期资产 + 结语</w:t>
-      </w:r>
-    </w:p>
-    <w:p>
-      <w:pPr>
-        <w:pStyle w:val="ListBullet"/>
-      </w:pPr>
-      <w:r>
-        <w:rPr>
-          <w:rFonts w:ascii="宋体" w:hAnsi="宋体" w:eastAsia="宋体"/>
-          <w:b w:val="0"/>
-          <w:sz w:val="22"/>
-        </w:rPr>
-        <w:t>电影联名 → 节日送茶 → 年度「给重要的人送茶」。</w:t>
-      </w:r>
-    </w:p>
-    <w:p>
-      <w:pPr>
-        <w:pStyle w:val="ListBullet"/>
-      </w:pPr>
-      <w:r>
-        <w:rPr>
-          <w:rFonts w:ascii="宋体" w:hAnsi="宋体" w:eastAsia="宋体"/>
-          <w:b w:val="0"/>
-          <w:sz w:val="22"/>
-        </w:rPr>
-        <w:t>喜茶不是复刻过去的一封信，而是在今天重新创造一种年轻人的表达方式。</w:t>
-      </w:r>
-    </w:p>
-    <w:p>
-      <w:pPr>
-        <w:spacing w:before="200" w:after="80"/>
-      </w:pPr>
-      <w:r>
-        <w:rPr>
-          <w:rFonts w:ascii="黑体" w:hAnsi="黑体" w:eastAsia="黑体"/>
-          <w:b/>
-          <w:sz w:val="28"/>
-        </w:rPr>
-        <w:t>Q&amp;A备忘</w:t>
+        <w:t>Q&amp;A</w:t>
       </w:r>
     </w:p>
     <w:p>
@@ -533,7 +494,7 @@
           <w:b w:val="0"/>
           <w:sz w:val="22"/>
         </w:rPr>
-        <w:t>会给父母买奶茶吗：场景是表达想念，不是「给父母买奶茶」；茶礼远距+现制即时。</w:t>
+        <w:t>会给父母买奶茶吗：场景是表达想念；茶礼远距+现制即时。</w:t>
       </w:r>
     </w:p>
     <w:p>
@@ -546,7 +507,7 @@
           <w:b w:val="0"/>
           <w:sz w:val="22"/>
         </w:rPr>
-        <w:t>为何是茶：茶连接家庭与问候；进入年轻消费场景，而非怀旧。</w:t>
+        <w:t>为何是茶：连接家庭与问候，进入年轻消费场景。</w:t>
       </w:r>
     </w:p>
     <w:sectPr>

</xml_diff>

<commit_message>
Final v9.1 submit polish: cover, wording, Q&A
Shorten homepage Hero; replace 生成 with 短笺定制/制作;
simplify box-office footnote; reframe Q&A as why Heytea fits;
keep images and structure unchanged.

Co-authored-by: Romola1110 <Romola1110@users.noreply.github.com>
</commit_message>
<xml_diff>
--- a/汇报提纲_心中念你_10页.docx
+++ b/汇报提纲_心中念你_10页.docx
@@ -12,7 +12,20 @@
           <w:b/>
           <w:sz w:val="30"/>
         </w:rPr>
-        <w:t>喜茶 ×《给阿嬷的情书》｜10页汇报提纲（v9收口）</w:t>
+        <w:t>喜茶 ×《给阿嬷的情书》｜10页汇报提纲（最终提交）</w:t>
+      </w:r>
+    </w:p>
+    <w:p>
+      <w:pPr>
+        <w:jc w:val="center"/>
+      </w:pPr>
+      <w:r>
+        <w:rPr>
+          <w:rFonts w:ascii="宋体" w:hAnsi="宋体" w:eastAsia="宋体"/>
+          <w:b/>
+          <w:sz w:val="22"/>
+        </w:rPr>
+        <w:t>Hero Idea：把一份想念，寄到TA手里</w:t>
       </w:r>
     </w:p>
     <w:p>
@@ -26,7 +39,7 @@
           <w:color w:val="5A5A5A"/>
           <w:sz w:val="20"/>
         </w:rPr>
-        <w:t>Campaign《心中念你》｜Hero：把一份想念，寄到TA手里｜2026-07-27</w:t>
+        <w:t>即时表达：给想念的人，一杯茶　｜　远距礼赠：给想念的人，一盒茶</w:t>
       </w:r>
     </w:p>
     <w:p>
@@ -39,7 +52,7 @@
           <w:b/>
           <w:sz w:val="26"/>
         </w:rPr>
-        <w:t>01 项目判断</w:t>
+        <w:t>01 判断</w:t>
       </w:r>
     </w:p>
     <w:p>
@@ -52,7 +65,7 @@
           <w:b w:val="0"/>
           <w:sz w:val="22"/>
         </w:rPr>
-        <w:t>从流量联名到资产联名；喜茶需补「有温度」的关系表达入口。</w:t>
+        <w:t>资产联名窗口；喜茶适合做关系表达入口。</w:t>
       </w:r>
     </w:p>
     <w:p>
@@ -65,20 +78,7 @@
           <w:b w:val="0"/>
           <w:sz w:val="22"/>
         </w:rPr>
-        <w:t>为何是喜茶：高频年轻触点 + 可即时发生的关系动作（相对传统礼赠/纯文化商品）。</w:t>
-      </w:r>
-    </w:p>
-    <w:p>
-      <w:pPr>
-        <w:pStyle w:val="ListBullet"/>
-      </w:pPr>
-      <w:r>
-        <w:rPr>
-          <w:rFonts w:ascii="宋体" w:hAnsi="宋体" w:eastAsia="宋体"/>
-          <w:b w:val="0"/>
-          <w:sz w:val="22"/>
-        </w:rPr>
-        <w:t>商业灵魂：从喝茶到送茶，从个人消费到关系消费。</w:t>
+        <w:t>灵魂：从喝茶到送茶，从个人消费到关系消费。</w:t>
       </w:r>
     </w:p>
     <w:p>
@@ -104,7 +104,7 @@
           <w:b w:val="0"/>
           <w:sz w:val="22"/>
         </w:rPr>
-        <w:t>核心表达者：22–35（22–28离家求学/初职场；28–35家庭礼赠）。</w:t>
+        <w:t>表达者22–35两圈；接受者=重要关系人。</w:t>
       </w:r>
     </w:p>
     <w:p>
@@ -117,7 +117,20 @@
           <w:b w:val="0"/>
           <w:sz w:val="22"/>
         </w:rPr>
-        <w:t>接受者：父母/长辈等重要关系人。</w:t>
+        <w:t>有爱，但不知道如何开口。</w:t>
+      </w:r>
+    </w:p>
+    <w:p>
+      <w:pPr>
+        <w:spacing w:before="160" w:after="60"/>
+      </w:pPr>
+      <w:r>
+        <w:rPr>
+          <w:rFonts w:ascii="黑体" w:hAnsi="黑体" w:eastAsia="黑体"/>
+          <w:b/>
+          <w:sz w:val="26"/>
+        </w:rPr>
+        <w:t>03 Hero</w:t>
       </w:r>
     </w:p>
     <w:p>
@@ -130,7 +143,20 @@
           <w:b w:val="0"/>
           <w:sz w:val="22"/>
         </w:rPr>
-        <w:t>痛点：有爱，但不知道如何开口。</w:t>
+        <w:t>把一份想念，寄到TA手里。</w:t>
+      </w:r>
+    </w:p>
+    <w:p>
+      <w:pPr>
+        <w:pStyle w:val="ListBullet"/>
+      </w:pPr>
+      <w:r>
+        <w:rPr>
+          <w:rFonts w:ascii="宋体" w:hAnsi="宋体" w:eastAsia="宋体"/>
+          <w:b w:val="0"/>
+          <w:sz w:val="22"/>
+        </w:rPr>
+        <w:t>一杯茶 / 一盒茶 / 写下一句想念。</w:t>
       </w:r>
     </w:p>
     <w:p>
@@ -143,7 +169,7 @@
           <w:b/>
           <w:sz w:val="26"/>
         </w:rPr>
-        <w:t>03 Hero与三场景</w:t>
+        <w:t>04 产品</w:t>
       </w:r>
     </w:p>
     <w:p>
@@ -156,7 +182,20 @@
           <w:b w:val="0"/>
           <w:sz w:val="22"/>
         </w:rPr>
-        <w:t>Campaign《心中念你》｜Hero：把一份想念，寄到TA手里。</w:t>
+        <w:t>现制走量+文化限定；茶礼=送茶战略工具。</w:t>
+      </w:r>
+    </w:p>
+    <w:p>
+      <w:pPr>
+        <w:spacing w:before="160" w:after="60"/>
+      </w:pPr>
+      <w:r>
+        <w:rPr>
+          <w:rFonts w:ascii="黑体" w:hAnsi="黑体" w:eastAsia="黑体"/>
+          <w:b/>
+          <w:sz w:val="26"/>
+        </w:rPr>
+        <w:t>05 茶礼</w:t>
       </w:r>
     </w:p>
     <w:p>
@@ -169,7 +208,20 @@
           <w:b w:val="0"/>
           <w:sz w:val="22"/>
         </w:rPr>
-        <w:t>即时：给想念的人，一杯茶｜异地：给想念的人，一盒茶｜留存：写下一句想念。</w:t>
+        <w:t>解决跨地域；探索可寄达；价格仅验证场景。</w:t>
+      </w:r>
+    </w:p>
+    <w:p>
+      <w:pPr>
+        <w:spacing w:before="160" w:after="60"/>
+      </w:pPr>
+      <w:r>
+        <w:rPr>
+          <w:rFonts w:ascii="黑体" w:hAnsi="黑体" w:eastAsia="黑体"/>
+          <w:b/>
+          <w:sz w:val="26"/>
+        </w:rPr>
+        <w:t>06 KPI</w:t>
       </w:r>
     </w:p>
     <w:p>
@@ -182,150 +234,7 @@
           <w:b w:val="0"/>
           <w:sz w:val="22"/>
         </w:rPr>
-        <w:t>入口：APP / 小程序 / 外卖送给TA / 电商茶礼。</w:t>
-      </w:r>
-    </w:p>
-    <w:p>
-      <w:pPr>
-        <w:spacing w:before="160" w:after="60"/>
-      </w:pPr>
-      <w:r>
-        <w:rPr>
-          <w:rFonts w:ascii="黑体" w:hAnsi="黑体" w:eastAsia="黑体"/>
-          <w:b/>
-          <w:sz w:val="26"/>
-        </w:rPr>
-        <w:t>04 产品三层</w:t>
-      </w:r>
-    </w:p>
-    <w:p>
-      <w:pPr>
-        <w:pStyle w:val="ListBullet"/>
-      </w:pPr>
-      <w:r>
-        <w:rPr>
-          <w:rFonts w:ascii="宋体" w:hAnsi="宋体" w:eastAsia="宋体"/>
-          <w:b w:val="0"/>
-          <w:sz w:val="22"/>
-        </w:rPr>
-        <w:t>现制：念你牛乳茶 / 南枝橄榄茶 / 归信桂花茶。</w:t>
-      </w:r>
-    </w:p>
-    <w:p>
-      <w:pPr>
-        <w:pStyle w:val="ListBullet"/>
-      </w:pPr>
-      <w:r>
-        <w:rPr>
-          <w:rFonts w:ascii="宋体" w:hAnsi="宋体" w:eastAsia="宋体"/>
-          <w:b w:val="0"/>
-          <w:sz w:val="22"/>
-        </w:rPr>
-        <w:t>茶礼：探索可寄达形态（战略工具，非为扩SKU）。</w:t>
-      </w:r>
-    </w:p>
-    <w:p>
-      <w:pPr>
-        <w:pStyle w:val="ListBullet"/>
-      </w:pPr>
-      <w:r>
-        <w:rPr>
-          <w:rFonts w:ascii="宋体" w:hAnsi="宋体" w:eastAsia="宋体"/>
-          <w:b w:val="0"/>
-          <w:sz w:val="22"/>
-        </w:rPr>
-        <w:t>邮局 × 许多句念你。</w:t>
-      </w:r>
-    </w:p>
-    <w:p>
-      <w:pPr>
-        <w:spacing w:before="160" w:after="60"/>
-      </w:pPr>
-      <w:r>
-        <w:rPr>
-          <w:rFonts w:ascii="黑体" w:hAnsi="黑体" w:eastAsia="黑体"/>
-          <w:b/>
-          <w:sz w:val="26"/>
-        </w:rPr>
-        <w:t>05 茶礼为何必要</w:t>
-      </w:r>
-    </w:p>
-    <w:p>
-      <w:pPr>
-        <w:pStyle w:val="ListBullet"/>
-      </w:pPr>
-      <w:r>
-        <w:rPr>
-          <w:rFonts w:ascii="宋体" w:hAnsi="宋体" w:eastAsia="宋体"/>
-          <w:b w:val="0"/>
-          <w:sz w:val="22"/>
-        </w:rPr>
-        <w:t>解决现制无法跨地域表达；是送茶成立的必要基础。</w:t>
-      </w:r>
-    </w:p>
-    <w:p>
-      <w:pPr>
-        <w:pStyle w:val="ListBullet"/>
-      </w:pPr>
-      <w:r>
-        <w:rPr>
-          <w:rFonts w:ascii="宋体" w:hAnsi="宋体" w:eastAsia="宋体"/>
-          <w:b w:val="0"/>
-          <w:sz w:val="22"/>
-        </w:rPr>
-        <w:t>示意价仅验证场景，非正式定价。</w:t>
-      </w:r>
-    </w:p>
-    <w:p>
-      <w:pPr>
-        <w:spacing w:before="160" w:after="60"/>
-      </w:pPr>
-      <w:r>
-        <w:rPr>
-          <w:rFonts w:ascii="黑体" w:hAnsi="黑体" w:eastAsia="黑体"/>
-          <w:b/>
-          <w:sz w:val="26"/>
-        </w:rPr>
-        <w:t>06 KPI（先卖不卖）</w:t>
-      </w:r>
-    </w:p>
-    <w:p>
-      <w:pPr>
-        <w:pStyle w:val="ListBullet"/>
-      </w:pPr>
-      <w:r>
-        <w:rPr>
-          <w:rFonts w:ascii="宋体" w:hAnsi="宋体" w:eastAsia="宋体"/>
-          <w:b w:val="0"/>
-          <w:sz w:val="22"/>
-        </w:rPr>
-        <w:t>销售：联名销售额、杯量、茶礼、客单。</w:t>
-      </w:r>
-    </w:p>
-    <w:p>
-      <w:pPr>
-        <w:pStyle w:val="ListBullet"/>
-      </w:pPr>
-      <w:r>
-        <w:rPr>
-          <w:rFonts w:ascii="宋体" w:hAnsi="宋体" w:eastAsia="宋体"/>
-          <w:b w:val="0"/>
-          <w:sz w:val="22"/>
-        </w:rPr>
-        <w:t>转化：购买率、礼赠GMV占比、连带购买率、送礼订单占比。</w:t>
-      </w:r>
-    </w:p>
-    <w:p>
-      <w:pPr>
-        <w:pStyle w:val="ListBullet"/>
-      </w:pPr>
-      <w:r>
-        <w:rPr>
-          <w:rFonts w:ascii="宋体" w:hAnsi="宋体" w:eastAsia="宋体"/>
-          <w:b w:val="0"/>
-          <w:sz w:val="22"/>
-        </w:rPr>
-        <w:t>内容资产量级按试点调整，不拍脑袋承诺。</w:t>
+        <w:t>先讲销售额与送礼订单占比、连带购买率。</w:t>
       </w:r>
     </w:p>
     <w:p>
@@ -351,20 +260,7 @@
           <w:b w:val="0"/>
           <w:sz w:val="22"/>
         </w:rPr>
-        <w:t>华南+沪/京小规模验证；三阶段门禁。</w:t>
-      </w:r>
-    </w:p>
-    <w:p>
-      <w:pPr>
-        <w:pStyle w:val="ListBullet"/>
-      </w:pPr>
-      <w:r>
-        <w:rPr>
-          <w:rFonts w:ascii="宋体" w:hAnsi="宋体" w:eastAsia="宋体"/>
-          <w:b w:val="0"/>
-          <w:sz w:val="22"/>
-        </w:rPr>
-        <w:t>邮局轻互动 + 会员二次触达。</w:t>
+        <w:t>小规模验证；邮局轻互动；会员回流。</w:t>
       </w:r>
     </w:p>
     <w:p>
@@ -390,20 +286,7 @@
           <w:b w:val="0"/>
           <w:sz w:val="22"/>
         </w:rPr>
-        <w:t>唯一主KV：把一份想念，寄到TA手里。</w:t>
-      </w:r>
-    </w:p>
-    <w:p>
-      <w:pPr>
-        <w:pStyle w:val="ListBullet"/>
-      </w:pPr>
-      <w:r>
-        <w:rPr>
-          <w:rFonts w:ascii="宋体" w:hAnsi="宋体" w:eastAsia="宋体"/>
-          <w:b w:val="0"/>
-          <w:sz w:val="22"/>
-        </w:rPr>
-        <w:t>延展：一杯茶 / 一盒茶 / 写下一句想念。</w:t>
+        <w:t>唯一主KV=Hero；其余为延展。</w:t>
       </w:r>
     </w:p>
     <w:p>
@@ -429,7 +312,7 @@
           <w:b w:val="0"/>
           <w:sz w:val="22"/>
         </w:rPr>
-        <w:t>茶礼探索语气；远距不靠现制券；数据脚注化；隐私三选一。</w:t>
+        <w:t>探索语气；脚注数据；隐私三选一。</w:t>
       </w:r>
     </w:p>
     <w:p>
@@ -455,7 +338,7 @@
           <w:b w:val="0"/>
           <w:sz w:val="22"/>
         </w:rPr>
-        <w:t>从满足「我喜欢喝什么」，到回应「我想把什么送给重要的人」。</w:t>
+        <w:t>从「我喜欢喝什么」到「我想把什么送给重要的人」。</w:t>
       </w:r>
     </w:p>
     <w:p>
@@ -481,7 +364,7 @@
           <w:b w:val="0"/>
           <w:sz w:val="22"/>
         </w:rPr>
-        <w:t>为何不是瑞幸：高频即时 vs 喜茶东方美学与关系媒介资产。</w:t>
+        <w:t>为什么喜茶适合做，而不是普通茶饮品牌：核心不是卖一杯茶，而是建立东方文化与关系表达的连接；喜茶有年轻用户基础与东方美学资产，更适合做表达入口。</w:t>
       </w:r>
     </w:p>
     <w:p>
@@ -508,6 +391,17 @@
           <w:sz w:val="22"/>
         </w:rPr>
         <w:t>为何是茶：连接家庭与问候，进入年轻消费场景。</w:t>
+      </w:r>
+    </w:p>
+    <w:p>
+      <w:r>
+        <w:rPr>
+          <w:rFonts w:ascii="宋体" w:hAnsi="宋体" w:eastAsia="宋体"/>
+          <w:b w:val="0"/>
+          <w:color w:val="6E6E6E"/>
+          <w:sz w:val="18"/>
+        </w:rPr>
+        <w:t>现场只讲：判断→洞察→Hero→产品→商业模型→KPI→长期资产；其余backup。</w:t>
       </w:r>
     </w:p>
     <w:sectPr>

</xml_diff>

<commit_message>
Delivery closeout v9.2: compress mainline, demote SKUs
Mark backup sections; keep 3 hero SKUs and treat 南枝/归信 as
extensions; soften 侨批=茶; emphasize gift-ratio KPIs; no image changes.

Co-authored-by: Romola1110 <Romola1110@users.noreply.github.com>
</commit_message>
<xml_diff>
--- a/汇报提纲_心中念你_10页.docx
+++ b/汇报提纲_心中念你_10页.docx
@@ -12,7 +12,7 @@
           <w:b/>
           <w:sz w:val="30"/>
         </w:rPr>
-        <w:t>喜茶 ×《给阿嬷的情书》｜10页汇报提纲（最终提交）</w:t>
+        <w:t>喜茶 ×《给阿嬷的情书》｜现场主讲提纲（交付版）</w:t>
       </w:r>
     </w:p>
     <w:p>
@@ -25,7 +25,7 @@
           <w:b/>
           <w:sz w:val="22"/>
         </w:rPr>
-        <w:t>Hero Idea：把一份想念，寄到TA手里</w:t>
+        <w:t>Hero：把一份想念，寄到TA手里</w:t>
       </w:r>
     </w:p>
     <w:p>
@@ -39,7 +39,7 @@
           <w:color w:val="5A5A5A"/>
           <w:sz w:val="20"/>
         </w:rPr>
-        <w:t>即时表达：给想念的人，一杯茶　｜　远距礼赠：给想念的人，一盒茶</w:t>
+        <w:t>即时：一杯茶　｜　远距：一盒茶　｜　留存：写下一句想念</w:t>
       </w:r>
     </w:p>
     <w:p>
@@ -52,7 +52,7 @@
           <w:b/>
           <w:sz w:val="26"/>
         </w:rPr>
-        <w:t>01 判断</w:t>
+        <w:t>1 判断</w:t>
       </w:r>
     </w:p>
     <w:p>
@@ -65,7 +65,7 @@
           <w:b w:val="0"/>
           <w:sz w:val="22"/>
         </w:rPr>
-        <w:t>资产联名窗口；喜茶适合做关系表达入口。</w:t>
+        <w:t>喜茶=年轻人表达关系的入口。</w:t>
       </w:r>
     </w:p>
     <w:p>
@@ -78,7 +78,7 @@
           <w:b w:val="0"/>
           <w:sz w:val="22"/>
         </w:rPr>
-        <w:t>灵魂：从喝茶到送茶，从个人消费到关系消费。</w:t>
+        <w:t>灵魂：从喝茶到送茶，从我喜欢喝什么到我想给谁喝。</w:t>
       </w:r>
     </w:p>
     <w:p>
@@ -91,7 +91,7 @@
           <w:b/>
           <w:sz w:val="26"/>
         </w:rPr>
-        <w:t>02 洞察</w:t>
+        <w:t>2 洞察</w:t>
       </w:r>
     </w:p>
     <w:p>
@@ -104,7 +104,7 @@
           <w:b w:val="0"/>
           <w:sz w:val="22"/>
         </w:rPr>
-        <w:t>表达者22–35两圈；接受者=重要关系人。</w:t>
+        <w:t>表达者22–35；接受者=重要关系人。</w:t>
       </w:r>
     </w:p>
     <w:p>
@@ -130,7 +130,7 @@
           <w:b/>
           <w:sz w:val="26"/>
         </w:rPr>
-        <w:t>03 Hero</w:t>
+        <w:t>3 Hero</w:t>
       </w:r>
     </w:p>
     <w:p>
@@ -156,7 +156,7 @@
           <w:b w:val="0"/>
           <w:sz w:val="22"/>
         </w:rPr>
-        <w:t>一杯茶 / 一盒茶 / 写下一句想念。</w:t>
+        <w:t>喝到/送到/留下。</w:t>
       </w:r>
     </w:p>
     <w:p>
@@ -169,7 +169,7 @@
           <w:b/>
           <w:sz w:val="26"/>
         </w:rPr>
-        <w:t>04 产品</w:t>
+        <w:t>4 产品（只讲主推）</w:t>
       </w:r>
     </w:p>
     <w:p>
@@ -182,7 +182,46 @@
           <w:b w:val="0"/>
           <w:sz w:val="22"/>
         </w:rPr>
-        <w:t>现制走量+文化限定；茶礼=送茶战略工具。</w:t>
+        <w:t>现制：念你·焙香牛乳茶</w:t>
+      </w:r>
+    </w:p>
+    <w:p>
+      <w:pPr>
+        <w:pStyle w:val="ListBullet"/>
+      </w:pPr>
+      <w:r>
+        <w:rPr>
+          <w:rFonts w:ascii="宋体" w:hAnsi="宋体" w:eastAsia="宋体"/>
+          <w:b w:val="0"/>
+          <w:sz w:val="22"/>
+        </w:rPr>
+        <w:t>礼赠：念你茶礼（战略工具）</w:t>
+      </w:r>
+    </w:p>
+    <w:p>
+      <w:pPr>
+        <w:pStyle w:val="ListBullet"/>
+      </w:pPr>
+      <w:r>
+        <w:rPr>
+          <w:rFonts w:ascii="宋体" w:hAnsi="宋体" w:eastAsia="宋体"/>
+          <w:b w:val="0"/>
+          <w:sz w:val="22"/>
+        </w:rPr>
+        <w:t>体验：念你邮局</w:t>
+      </w:r>
+    </w:p>
+    <w:p>
+      <w:pPr>
+        <w:pStyle w:val="ListBullet"/>
+      </w:pPr>
+      <w:r>
+        <w:rPr>
+          <w:rFonts w:ascii="宋体" w:hAnsi="宋体" w:eastAsia="宋体"/>
+          <w:b w:val="0"/>
+          <w:sz w:val="22"/>
+        </w:rPr>
+        <w:t>南枝/归信=延展方向，不是一次全开SKU</w:t>
       </w:r>
     </w:p>
     <w:p>
@@ -195,7 +234,7 @@
           <w:b/>
           <w:sz w:val="26"/>
         </w:rPr>
-        <w:t>05 茶礼</w:t>
+        <w:t>5 商业模型</w:t>
       </w:r>
     </w:p>
     <w:p>
@@ -208,7 +247,20 @@
           <w:b w:val="0"/>
           <w:sz w:val="22"/>
         </w:rPr>
-        <w:t>解决跨地域；探索可寄达；价格仅验证场景。</w:t>
+        <w:t>四种入口；茶礼解决跨地域。</w:t>
+      </w:r>
+    </w:p>
+    <w:p>
+      <w:pPr>
+        <w:pStyle w:val="ListBullet"/>
+      </w:pPr>
+      <w:r>
+        <w:rPr>
+          <w:rFonts w:ascii="宋体" w:hAnsi="宋体" w:eastAsia="宋体"/>
+          <w:b w:val="0"/>
+          <w:sz w:val="22"/>
+        </w:rPr>
+        <w:t>价格仅验证场景。</w:t>
       </w:r>
     </w:p>
     <w:p>
@@ -221,7 +273,7 @@
           <w:b/>
           <w:sz w:val="26"/>
         </w:rPr>
-        <w:t>06 KPI</w:t>
+        <w:t>6 KPI</w:t>
       </w:r>
     </w:p>
     <w:p>
@@ -234,7 +286,20 @@
           <w:b w:val="0"/>
           <w:sz w:val="22"/>
         </w:rPr>
-        <w:t>先讲销售额与送礼订单占比、连带购买率。</w:t>
+        <w:t>核心：礼赠订单占比、送给TA转化率、茶礼购买占比。</w:t>
+      </w:r>
+    </w:p>
+    <w:p>
+      <w:pPr>
+        <w:pStyle w:val="ListBullet"/>
+      </w:pPr>
+      <w:r>
+        <w:rPr>
+          <w:rFonts w:ascii="宋体" w:hAnsi="宋体" w:eastAsia="宋体"/>
+          <w:b w:val="0"/>
+          <w:sz w:val="22"/>
+        </w:rPr>
+        <w:t>再看销售额、客单、会员。</w:t>
       </w:r>
     </w:p>
     <w:p>
@@ -247,7 +312,7 @@
           <w:b/>
           <w:sz w:val="26"/>
         </w:rPr>
-        <w:t>07 执行</w:t>
+        <w:t>7 长期资产</w:t>
       </w:r>
     </w:p>
     <w:p>
@@ -260,7 +325,20 @@
           <w:b w:val="0"/>
           <w:sz w:val="22"/>
         </w:rPr>
-        <w:t>小规模验证；邮局轻互动；会员回流。</w:t>
+        <w:t>电影联名→节日送茶→年度关系表达入口。</w:t>
+      </w:r>
+    </w:p>
+    <w:p>
+      <w:pPr>
+        <w:pStyle w:val="ListBullet"/>
+      </w:pPr>
+      <w:r>
+        <w:rPr>
+          <w:rFonts w:ascii="宋体" w:hAnsi="宋体" w:eastAsia="宋体"/>
+          <w:b w:val="0"/>
+          <w:sz w:val="22"/>
+        </w:rPr>
+        <w:t>收口：从我喜欢喝什么，到我想把什么送给重要的人。</w:t>
       </w:r>
     </w:p>
     <w:p>
@@ -273,7 +351,7 @@
           <w:b/>
           <w:sz w:val="26"/>
         </w:rPr>
-        <w:t>08 视觉</w:t>
+        <w:t>Backup不讲</w:t>
       </w:r>
     </w:p>
     <w:p>
@@ -286,59 +364,7 @@
           <w:b w:val="0"/>
           <w:sz w:val="22"/>
         </w:rPr>
-        <w:t>唯一主KV=Hero；其余为延展。</w:t>
-      </w:r>
-    </w:p>
-    <w:p>
-      <w:pPr>
-        <w:spacing w:before="160" w:after="60"/>
-      </w:pPr>
-      <w:r>
-        <w:rPr>
-          <w:rFonts w:ascii="黑体" w:hAnsi="黑体" w:eastAsia="黑体"/>
-          <w:b/>
-          <w:sz w:val="26"/>
-        </w:rPr>
-        <w:t>09 风险</w:t>
-      </w:r>
-    </w:p>
-    <w:p>
-      <w:pPr>
-        <w:pStyle w:val="ListBullet"/>
-      </w:pPr>
-      <w:r>
-        <w:rPr>
-          <w:rFonts w:ascii="宋体" w:hAnsi="宋体" w:eastAsia="宋体"/>
-          <w:b w:val="0"/>
-          <w:sz w:val="22"/>
-        </w:rPr>
-        <w:t>探索语气；脚注数据；隐私三选一。</w:t>
-      </w:r>
-    </w:p>
-    <w:p>
-      <w:pPr>
-        <w:spacing w:before="160" w:after="60"/>
-      </w:pPr>
-      <w:r>
-        <w:rPr>
-          <w:rFonts w:ascii="黑体" w:hAnsi="黑体" w:eastAsia="黑体"/>
-          <w:b/>
-          <w:sz w:val="26"/>
-        </w:rPr>
-        <w:t>10 收口</w:t>
-      </w:r>
-    </w:p>
-    <w:p>
-      <w:pPr>
-        <w:pStyle w:val="ListBullet"/>
-      </w:pPr>
-      <w:r>
-        <w:rPr>
-          <w:rFonts w:ascii="宋体" w:hAnsi="宋体" w:eastAsia="宋体"/>
-          <w:b w:val="0"/>
-          <w:sz w:val="22"/>
-        </w:rPr>
-        <w:t>从「我喜欢喝什么」到「我想把什么送给重要的人」。</w:t>
+        <w:t>授权金句池、详细风险表、资源分项、Mockup细图、同城兑换礼细表。</w:t>
       </w:r>
     </w:p>
     <w:p>
@@ -364,7 +390,7 @@
           <w:b w:val="0"/>
           <w:sz w:val="22"/>
         </w:rPr>
-        <w:t>为什么喜茶适合做，而不是普通茶饮品牌：核心不是卖一杯茶，而是建立东方文化与关系表达的连接；喜茶有年轻用户基础与东方美学资产，更适合做表达入口。</w:t>
+        <w:t>为什么年轻人会给父母送喜茶：场景是表达想念，不是「给父母买奶茶」；茶礼远距+现制即时。</w:t>
       </w:r>
     </w:p>
     <w:p>
@@ -377,7 +403,7 @@
           <w:b w:val="0"/>
           <w:sz w:val="22"/>
         </w:rPr>
-        <w:t>会给父母买奶茶吗：场景是表达想念；茶礼远距+现制即时。</w:t>
+        <w:t>茶礼和普通礼盒区别：可寄达的茶+信，服务「送茶」成立，不是扩SKU。</w:t>
       </w:r>
     </w:p>
     <w:p>
@@ -390,7 +416,7 @@
           <w:b w:val="0"/>
           <w:sz w:val="22"/>
         </w:rPr>
-        <w:t>为何是茶：连接家庭与问候，进入年轻消费场景。</w:t>
+        <w:t>电影热度下降怎么办：沉淀为节日/年度送茶资产，不绑定单一档期。</w:t>
       </w:r>
     </w:p>
     <w:p>
@@ -401,7 +427,7 @@
           <w:color w:val="6E6E6E"/>
           <w:sz w:val="18"/>
         </w:rPr>
-        <w:t>现场只讲：判断→洞察→Hero→产品→商业模型→KPI→长期资产；其余backup。</w:t>
+        <w:t>现场只讲以上7步；完整Word作提交底稿。</w:t>
       </w:r>
     </w:p>
     <w:sectPr>

</xml_diff>

<commit_message>
v9.2: mark directory as backup speak-path
Co-authored-by: Romola1110 <Romola1110@users.noreply.github.com>
</commit_message>
<xml_diff>
--- a/汇报提纲_心中念你_10页.docx
+++ b/汇报提纲_心中念你_10页.docx
@@ -12,7 +12,7 @@
           <w:b/>
           <w:sz w:val="30"/>
         </w:rPr>
-        <w:t>喜茶 ×《给阿嬷的情书》｜现场主讲提纲（交付版）</w:t>
+        <w:t>喜茶 ×《给阿嬷的情书》｜现场主讲提纲（可交）</w:t>
       </w:r>
     </w:p>
     <w:p>
@@ -39,7 +39,7 @@
           <w:color w:val="5A5A5A"/>
           <w:sz w:val="20"/>
         </w:rPr>
-        <w:t>即时：一杯茶　｜　远距：一盒茶　｜　留存：写下一句想念</w:t>
+        <w:t>喝到（一杯）｜送到（一盒）｜留下（邮局）</w:t>
       </w:r>
     </w:p>
     <w:p>
@@ -156,7 +156,7 @@
           <w:b w:val="0"/>
           <w:sz w:val="22"/>
         </w:rPr>
-        <w:t>喝到/送到/留下。</w:t>
+        <w:t>喝到 / 送到 / 留下。</w:t>
       </w:r>
     </w:p>
     <w:p>
@@ -195,7 +195,7 @@
           <w:b w:val="0"/>
           <w:sz w:val="22"/>
         </w:rPr>
-        <w:t>礼赠：念你茶礼（战略工具）</w:t>
+        <w:t>礼赠：念你茶礼（战略工具，非扩SKU）</w:t>
       </w:r>
     </w:p>
     <w:p>
@@ -221,7 +221,7 @@
           <w:b w:val="0"/>
           <w:sz w:val="22"/>
         </w:rPr>
-        <w:t>南枝/归信=延展方向，不是一次全开SKU</w:t>
+        <w:t>南枝/归信=延展方向</w:t>
       </w:r>
     </w:p>
     <w:p>
@@ -252,19 +252,6 @@
     </w:p>
     <w:p>
       <w:pPr>
-        <w:pStyle w:val="ListBullet"/>
-      </w:pPr>
-      <w:r>
-        <w:rPr>
-          <w:rFonts w:ascii="宋体" w:hAnsi="宋体" w:eastAsia="宋体"/>
-          <w:b w:val="0"/>
-          <w:sz w:val="22"/>
-        </w:rPr>
-        <w:t>价格仅验证场景。</w:t>
-      </w:r>
-    </w:p>
-    <w:p>
-      <w:pPr>
         <w:spacing w:before="160" w:after="60"/>
       </w:pPr>
       <w:r>
@@ -287,19 +274,6 @@
           <w:sz w:val="22"/>
         </w:rPr>
         <w:t>核心：礼赠订单占比、送给TA转化率、茶礼购买占比。</w:t>
-      </w:r>
-    </w:p>
-    <w:p>
-      <w:pPr>
-        <w:pStyle w:val="ListBullet"/>
-      </w:pPr>
-      <w:r>
-        <w:rPr>
-          <w:rFonts w:ascii="宋体" w:hAnsi="宋体" w:eastAsia="宋体"/>
-          <w:b w:val="0"/>
-          <w:sz w:val="22"/>
-        </w:rPr>
-        <w:t>再看销售额、客单、会员。</w:t>
       </w:r>
     </w:p>
     <w:p>
@@ -338,7 +312,7 @@
           <w:b w:val="0"/>
           <w:sz w:val="22"/>
         </w:rPr>
-        <w:t>收口：从我喜欢喝什么，到我想把什么送给重要的人。</w:t>
+        <w:t>从我喜欢喝什么，到我想把什么送给重要的人。</w:t>
       </w:r>
     </w:p>
     <w:p>
@@ -351,7 +325,7 @@
           <w:b/>
           <w:sz w:val="26"/>
         </w:rPr>
-        <w:t>Backup不讲</w:t>
+        <w:t>Backup</w:t>
       </w:r>
     </w:p>
     <w:p>
@@ -364,7 +338,7 @@
           <w:b w:val="0"/>
           <w:sz w:val="22"/>
         </w:rPr>
-        <w:t>授权金句池、详细风险表、资源分项、Mockup细图、同城兑换礼细表。</w:t>
+        <w:t>授权金句、风险细表、资源分项、Mockup、同城兑换细表。</w:t>
       </w:r>
     </w:p>
     <w:p>
@@ -390,7 +364,7 @@
           <w:b w:val="0"/>
           <w:sz w:val="22"/>
         </w:rPr>
-        <w:t>为什么年轻人会给父母送喜茶：场景是表达想念，不是「给父母买奶茶」；茶礼远距+现制即时。</w:t>
+        <w:t>为什么给父母送喜茶：场景是表达想念；茶礼远距+现制即时。</w:t>
       </w:r>
     </w:p>
     <w:p>
@@ -403,7 +377,7 @@
           <w:b w:val="0"/>
           <w:sz w:val="22"/>
         </w:rPr>
-        <w:t>茶礼和普通礼盒区别：可寄达的茶+信，服务「送茶」成立，不是扩SKU。</w:t>
+        <w:t>茶礼 vs 普通礼盒：可寄达的茶+信，服务送茶成立。</w:t>
       </w:r>
     </w:p>
     <w:p>
@@ -416,18 +390,7 @@
           <w:b w:val="0"/>
           <w:sz w:val="22"/>
         </w:rPr>
-        <w:t>电影热度下降怎么办：沉淀为节日/年度送茶资产，不绑定单一档期。</w:t>
-      </w:r>
-    </w:p>
-    <w:p>
-      <w:r>
-        <w:rPr>
-          <w:rFonts w:ascii="宋体" w:hAnsi="宋体" w:eastAsia="宋体"/>
-          <w:b w:val="0"/>
-          <w:color w:val="6E6E6E"/>
-          <w:sz w:val="18"/>
-        </w:rPr>
-        <w:t>现场只讲以上7步；完整Word作提交底稿。</w:t>
+        <w:t>电影热度下降：沉淀为节日/年度送茶资产。</w:t>
       </w:r>
     </w:p>
     <w:sectPr>

</xml_diff>